<commit_message>
update: documentation and week3, week4 files
</commit_message>
<xml_diff>
--- a/Week1_Preparation/IR_Checklist.docx
+++ b/Week1_Preparation/IR_Checklist.docx
@@ -263,8 +263,25 @@
             <w14:round/>
           </w14:textOutline>
         </w:rPr>
-        <w:t>Email security monitoring enabled</w:t>
+        <w:t xml:space="preserve">Email security monitoring </w:t>
       </w:r>
+      <w:proofErr w:type="spellStart"/>
+      <w:r>
+        <w:rPr>
+          <w:rFonts w:cs="Aharoni"/>
+          <w:b/>
+          <w:color w:val="808080" w:themeColor="background1" w:themeShade="80"/>
+          <w:sz w:val="32"/>
+          <w:szCs w:val="32"/>
+          <w14:textOutline w14:w="0" w14:cap="flat" w14:cmpd="sng" w14:algn="ctr">
+            <w14:noFill/>
+            <w14:prstDash w14:val="solid"/>
+            <w14:round/>
+          </w14:textOutline>
+        </w:rPr>
+        <w:t>nabled</w:t>
+      </w:r>
+      <w:proofErr w:type="spellEnd"/>
     </w:p>
     <w:p>
       <w:pPr>
@@ -1407,6 +1424,7 @@
   <w:style w:type="character" w:default="1" w:styleId="DefaultParagraphFont">
     <w:name w:val="Default Paragraph Font"/>
     <w:uiPriority w:val="1"/>
+    <w:semiHidden/>
     <w:unhideWhenUsed/>
   </w:style>
   <w:style w:type="table" w:default="1" w:styleId="TableNormal">

</xml_diff>